<commit_message>
Docs: repoint to tracksuit-first + strategy/design/outreach packs (shared brain)
</commit_message>
<xml_diff>
--- a/TEE-SAMPLE-ORDER-SPEC.docx
+++ b/TEE-SAMPLE-ORDER-SPEC.docx
@@ -28,7 +28,7 @@
           <w:sz w:val="24"/>
           <w:szCs w:val="24"/>
         </w:rPr>
-        <w:t xml:space="preserve">SAMPLE ORDER SPEC — “THE DOCUMENT” TEE (DROP: EDITION 01)</w:t>
+        <w:t xml:space="preserve">SAMPLE ORDER SPEC — “THE VISION CHART” TEE (DROP: EDITION 01)</w:t>
       </w:r>
     </w:p>
     <w:p>
@@ -46,7 +46,7 @@
           <w:sz w:val="18"/>
           <w:szCs w:val="18"/>
         </w:rPr>
-        <w:t xml:space="preserve">July 2026 • Send this document to the printer/supplier as-is • Contact: Richard (richardmuodilim@gmail.com)</w:t>
+        <w:t xml:space="preserve">July 2026 • Send this document to the printer/supplier as-is, together with TVP-EDITION01-PRINT-ARTWORK.pdf and TVP-EDITION01-MOCKUP.png • Contact: Richard (richardmuodilim@gmail.com)</w:t>
       </w:r>
     </w:p>
     <w:p>
@@ -740,7 +740,7 @@
                 <w:sz w:val="20"/>
                 <w:szCs w:val="20"/>
               </w:rPr>
-              <w:t xml:space="preserve">Space Mono (free, Google Fonts), UPPERCASE, regular weight, letter-spacing approx +8%</w:t>
+              <w:t xml:space="preserve">Space Mono (set in the supplied vector files — do not substitute)</w:t>
             </w:r>
           </w:p>
         </w:tc>
@@ -756,7 +756,7 @@
         <w:pStyle w:val="Heading1"/>
       </w:pPr>
       <w:r>
-        <w:t xml:space="preserve">3. Placement A — back (main print)</w:t>
+        <w:t xml:space="preserve">3. Placement A — back: “THE VISION CHART” (main print)</w:t>
       </w:r>
     </w:p>
     <w:p>
@@ -764,7 +764,7 @@
         <w:spacing w:after="120"/>
       </w:pPr>
       <w:r>
-        <w:t xml:space="preserve">Centred horizontally on the back. Top of the print block sits 9-10 cm below the back collar seam. Total block width: 24 cm. The block contains, top to bottom:</w:t>
+        <w:t xml:space="preserve">The back print is designed as an optician's eye test chart (Snellen chart): six rows of text, each row smaller than the one above, separated by thin horizontal rules, with acuity marks (20/200 … 20/20) at the left edge. Centred horizontally on the back. Top of the chart sits 8-9 cm below the back collar seam. Total chart width: 26 cm, height approx 24-25 cm. PRINT DIRECTLY FROM THE SUPPLIED 1:1 VECTOR PDF (page 1) — do not re-set the type. Rows top to bottom:</w:t>
       </w:r>
     </w:p>
     <w:p>
@@ -781,10 +781,10 @@
           <w:b/>
           <w:bCs/>
         </w:rPr>
-        <w:t xml:space="preserve">Line 1-2 (the statement): </w:t>
-      </w:r>
-      <w:r>
-        <w:t xml:space="preserve">“BUILT FROM NOTHING” set on two lines (“BUILT FROM” / “NOTHING”), centred, cap height approx 2.8 cm per line, line gap approx 1.2 cm.</w:t>
+        <w:t xml:space="preserve">Row 1 (20/200): </w:t>
+      </w:r>
+      <w:r>
+        <w:t xml:space="preserve">“TV” — bold, cap height approx 6 cm.</w:t>
       </w:r>
     </w:p>
     <w:p>
@@ -801,10 +801,10 @@
           <w:b/>
           <w:bCs/>
         </w:rPr>
-        <w:t xml:space="preserve">Gap: </w:t>
-      </w:r>
-      <w:r>
-        <w:t xml:space="preserve">1.5 cm below the statement.</w:t>
+        <w:t xml:space="preserve">Row 2 (20/100): </w:t>
+      </w:r>
+      <w:r>
+        <w:t xml:space="preserve">“NOBODY” — bold, cap height approx 3.3 cm.</w:t>
       </w:r>
     </w:p>
     <w:p>
@@ -821,10 +821,10 @@
           <w:b/>
           <w:bCs/>
         </w:rPr>
-        <w:t xml:space="preserve">Line 3 (coordinates): </w:t>
-      </w:r>
-      <w:r>
-        <w:t xml:space="preserve">“WEXFORD 52.3369°N 6.4633°W · BERGAMO 45.6983°N 9.6773°E” — one line, centred, cap height approx 0.5 cm.</w:t>
+        <w:t xml:space="preserve">Row 3 (20/70): </w:t>
+      </w:r>
+      <w:r>
+        <w:t xml:space="preserve">“SAW US COMING” — bold, cap height approx 1.8 cm.</w:t>
       </w:r>
     </w:p>
     <w:p>
@@ -841,10 +841,10 @@
           <w:b/>
           <w:bCs/>
         </w:rPr>
-        <w:t xml:space="preserve">Line 4 (edition): </w:t>
-      </w:r>
-      <w:r>
-        <w:t xml:space="preserve">“EDITION 01 — N° ___ / 50” — one line, centred, cap height approx 0.5 cm, directly below line 3 with 0.6 cm gap. The number field stays BLANK on the screen; numbers are added per unit at fulfilment.</w:t>
+        <w:t xml:space="preserve">Row 4 (20/40): </w:t>
+      </w:r>
+      <w:r>
+        <w:t xml:space="preserve">“FOR THE ONES THEY DIDN'T SEE” — regular, cap height approx 0.8 cm.</w:t>
       </w:r>
     </w:p>
     <w:p>
@@ -861,10 +861,50 @@
           <w:b/>
           <w:bCs/>
         </w:rPr>
-        <w:t xml:space="preserve">Corner marks: </w:t>
-      </w:r>
-      <w:r>
-        <w:t xml:space="preserve">four thin right-angle corner marks (8 mm x 8 mm, approx 0.75 pt stroke) framing the whole block — top-left, top-right, bottom-left, bottom-right, positioned 1 cm outside the text block edges.</w:t>
+        <w:t xml:space="preserve">Row 5 (20/25): </w:t>
+      </w:r>
+      <w:r>
+        <w:t xml:space="preserve">“BUILT FROM NOTHING · IRELAND × ITALY” — regular, cap height approx 0.5 cm.</w:t>
+      </w:r>
+    </w:p>
+    <w:p>
+      <w:pPr>
+        <w:pStyle w:val="ListParagraph"/>
+        <w:numPr>
+          <w:ilvl w:val="0"/>
+          <w:numId w:val="2"/>
+        </w:numPr>
+        <w:spacing w:after="80"/>
+      </w:pPr>
+      <w:r>
+        <w:rPr>
+          <w:b/>
+          <w:bCs/>
+        </w:rPr>
+        <w:t xml:space="preserve">Row 6 (20/20): </w:t>
+      </w:r>
+      <w:r>
+        <w:t xml:space="preserve">“EDITION 01 · N° ___ / 50 · THE DOOR OPENS WITH ONE WORD” — regular, cap height approx 0.3 cm. This row MUST remain crisply legible at close range — confirm your screen mesh holds a 3 mm cap height cleanly (if not, quote DTG or transfer for this row only). The number field stays BLANK; numbers added per unit at fulfilment.</w:t>
+      </w:r>
+    </w:p>
+    <w:p>
+      <w:pPr>
+        <w:pStyle w:val="ListParagraph"/>
+        <w:numPr>
+          <w:ilvl w:val="0"/>
+          <w:numId w:val="2"/>
+        </w:numPr>
+        <w:spacing w:after="80"/>
+      </w:pPr>
+      <w:r>
+        <w:rPr>
+          <w:b/>
+          <w:bCs/>
+        </w:rPr>
+        <w:t xml:space="preserve">Rules: </w:t>
+      </w:r>
+      <w:r>
+        <w:t xml:space="preserve">thin horizontal rules (approx 0.3 mm stroke, 23 cm wide) between rows, as in the vector file.</w:t>
       </w:r>
     </w:p>
     <w:p>
@@ -880,7 +920,7 @@
         <w:spacing w:after="120"/>
       </w:pPr>
       <w:r>
-        <w:t xml:space="preserve">TVP “V” logo mark, 8 cm tall, positioned on the wearer's LEFT chest, approx 7-8 cm below the shoulder seam, aligned to the chest centre-left. Vector artwork supplied (logo.svg from brand files). Same black ink.</w:t>
+        <w:t xml:space="preserve">TVP “V” logo mark, 8 cm tall, positioned on the wearer's LEFT chest, approx 7-8 cm below the shoulder seam. Vector artwork on page 2 of the PDF. Same black ink.</w:t>
       </w:r>
     </w:p>
     <w:p>
@@ -896,7 +936,7 @@
         <w:spacing w:after="120"/>
       </w:pPr>
       <w:r>
-        <w:t xml:space="preserve">“NEVER FORGET WHERE YOU CAME FROM” — one line, centred inside the garment, 2 cm below the inside collar seam. Width approx 9 cm, cap height approx 0.4 cm. Same typeface and ink. This print faces the wearer — only they see it.</w:t>
+        <w:t xml:space="preserve">“NEVER FORGET WHERE YOU CAME FROM” — one line, centred inside the garment, 2 cm below the inside collar seam. Width approx 9 cm. Page 3 of the PDF. This print faces the wearer — only they see it.</w:t>
       </w:r>
     </w:p>
     <w:p>
@@ -912,7 +952,7 @@
         <w:spacing w:after="120"/>
       </w:pPr>
       <w:r>
-        <w:t xml:space="preserve">Typesetter sets the type per this spec using Space Mono (Google Fonts, free). Vector V-logo supplied separately. If your studio prefers supplied print-ready files, tell us and we will deliver final vectors (AI/PDF/EPS) to your template within 48 hours.</w:t>
+        <w:t xml:space="preserve">All artwork is supplied print-ready and 1:1 scale in TVP-EDITION01-PRINT-ARTWORK.pdf (3 pages: back chart / front V / inside neck). If your studio needs a different format (AI/EPS/separations), tell us and we deliver within 48 hours.</w:t>
       </w:r>
     </w:p>
     <w:p>
@@ -920,7 +960,7 @@
         <w:pStyle w:val="Heading1"/>
       </w:pPr>
       <w:r>
-        <w:t xml:space="preserve">7. Sample approval checklist (what we check before the 50-unit run)</w:t>
+        <w:t xml:space="preserve">7. Sample approval checklist (before the 50-unit run)</w:t>
       </w:r>
     </w:p>
     <w:p>
@@ -933,7 +973,7 @@
         <w:spacing w:after="60"/>
       </w:pPr>
       <w:r>
-        <w:t xml:space="preserve">Fabric weight and structure: must feel heavy (240+ GSM), boxy drape, no thin-tee feel.</w:t>
+        <w:t xml:space="preserve">Fabric weight and structure: heavy (240+ GSM), boxy drape, no thin-tee feel.</w:t>
       </w:r>
     </w:p>
     <w:p>
@@ -946,7 +986,7 @@
         <w:spacing w:after="60"/>
       </w:pPr>
       <w:r>
-        <w:t xml:space="preserve">Print position and sizes vs this spec (we will measure).</w:t>
+        <w:t xml:space="preserve">Print position and row sizes vs the vector file (we will measure).</w:t>
       </w:r>
     </w:p>
     <w:p>
@@ -959,7 +999,7 @@
         <w:spacing w:after="60"/>
       </w:pPr>
       <w:r>
-        <w:t xml:space="preserve">Matte finish: no shine, soft hand feel.</w:t>
+        <w:t xml:space="preserve">Row 6 legibility at close range — the make-or-break detail of this design.</w:t>
       </w:r>
     </w:p>
     <w:p>
@@ -972,6 +1012,19 @@
         <w:spacing w:after="60"/>
       </w:pPr>
       <w:r>
+        <w:t xml:space="preserve">Matte finish: no shine, soft hand feel.</w:t>
+      </w:r>
+    </w:p>
+    <w:p>
+      <w:pPr>
+        <w:pStyle w:val="ListParagraph"/>
+        <w:numPr>
+          <w:ilvl w:val="0"/>
+          <w:numId w:val="3"/>
+        </w:numPr>
+        <w:spacing w:after="60"/>
+      </w:pPr>
+      <w:r>
         <w:t xml:space="preserve">Wash test: 3 washes at 30°C — no cracking, no fading, collar holds shape.</w:t>
       </w:r>
     </w:p>
@@ -985,7 +1038,7 @@
         <w:spacing w:after="160"/>
       </w:pPr>
       <w:r>
-        <w:t xml:space="preserve">Colour match: garment vs #F5F3EE reference, ink vs #111111 reference, in daylight photo.</w:t>
+        <w:t xml:space="preserve">Colour match: garment vs #F5F3EE, ink vs #111111, daylight photo.</w:t>
       </w:r>
     </w:p>
     <w:p>
@@ -1013,7 +1066,7 @@
         <w:t xml:space="preserve">Sample: </w:t>
       </w:r>
       <w:r>
-        <w:t xml:space="preserve">1 unit, size M, full print, shipped to Ireland (address provided on order). Please quote sample cost + production unit cost at 50 units + lead times.</w:t>
+        <w:t xml:space="preserve">1 unit, size M, full print, shipped to Ireland (address on order). Quote sample cost + production unit cost at 50 units + lead times.</w:t>
       </w:r>
     </w:p>
     <w:p>
@@ -1051,7 +1104,7 @@
           <w:sz w:val="18"/>
           <w:szCs w:val="18"/>
         </w:rPr>
-        <w:t xml:space="preserve">TVP — Built from nothing. Worn by those who understand.</w:t>
+        <w:t xml:space="preserve">TVP — Nobody saw us coming.</w:t>
       </w:r>
     </w:p>
     <w:sectPr>

</xml_diff>